<commit_message>
Figures inserted in v20, references finalized, heatmap cell added to NB01, EPIC citation corrected
</commit_message>
<xml_diff>
--- a/paper/Dunlap_EPIC_Article_Submission.docx
+++ b/paper/Dunlap_EPIC_Article_Submission.docx
@@ -337,19 +337,7 @@
           <w:lang w:eastAsia="zh-TW"/>
           <w14:ligatures w14:val="none"/>
         </w:rPr>
-        <w:t xml:space="preserve"> </w:t>
-      </w:r>
-      <w:proofErr w:type="spellStart"/>
-      <w:r>
-        <w:rPr>
-          <w:rFonts w:ascii="Times New Roman" w:eastAsia="Times New Roman" w:hAnsi="Times New Roman" w:cs="Times New Roman"/>
-          <w:color w:val="000000"/>
-          <w:kern w:val="0"/>
-          <w:szCs w:val="20"/>
-          <w:lang w:eastAsia="zh-TW"/>
-          <w14:ligatures w14:val="none"/>
-        </w:rPr>
-        <w:t>hyper</w:t>
+        <w:t xml:space="preserve"> hyper</w:t>
       </w:r>
       <w:r>
         <w:rPr>
@@ -373,7 +361,6 @@
         </w:rPr>
         <w:t>calers</w:t>
       </w:r>
-      <w:proofErr w:type="spellEnd"/>
       <w:r>
         <w:rPr>
           <w:rFonts w:ascii="Times New Roman" w:eastAsia="Times New Roman" w:hAnsi="Times New Roman" w:cs="Times New Roman"/>
@@ -874,7 +861,29 @@
           <w:lang w:eastAsia="zh-TW"/>
           <w14:ligatures w14:val="none"/>
         </w:rPr>
-        <w:t>What has received less attention is the demand side. Recent work by Norris and colleagues at Duke's Nicholas Institute has demonstrated that load flexibility on the order of 0.1% of annual hours could unlock approximately 100 GW of capacity using existing transmission infrastructure, translating to economic value exceeding $160/MW-day in constrained markets.</w:t>
+        <w:t xml:space="preserve">What has received less attention is the demand side. Recent work by </w:t>
+      </w:r>
+      <w:r>
+        <w:rPr>
+          <w:rFonts w:ascii="Times New Roman" w:eastAsia="Times New Roman" w:hAnsi="Times New Roman" w:cs="Times New Roman"/>
+          <w:color w:val="000000"/>
+          <w:kern w:val="0"/>
+          <w:szCs w:val="20"/>
+          <w:lang w:eastAsia="zh-TW"/>
+          <w14:ligatures w14:val="none"/>
+        </w:rPr>
+        <w:t>Norris and colleagues at Duke's Nicholas Institute demonstrated that the 22 largest U.S. balancing authorities could accommodate approximately 100 GW of new flexible load using existing system capacity, with an average annual curtailment rate of 0.5% and an average curtailment duration of approximately two hours</w:t>
+      </w:r>
+      <w:r>
+        <w:rPr>
+          <w:rFonts w:ascii="Times New Roman" w:eastAsia="Times New Roman" w:hAnsi="Times New Roman" w:cs="Times New Roman"/>
+          <w:color w:val="000000"/>
+          <w:kern w:val="0"/>
+          <w:szCs w:val="20"/>
+          <w:lang w:eastAsia="zh-TW"/>
+          <w14:ligatures w14:val="none"/>
+        </w:rPr>
+        <w:t>.</w:t>
       </w:r>
       <w:r>
         <w:rPr>
@@ -1277,7 +1286,6 @@
         </w:rPr>
         <w:t xml:space="preserve">What </w:t>
       </w:r>
-      <w:proofErr w:type="gramStart"/>
       <w:r>
         <w:rPr>
           <w:rFonts w:ascii="Times New Roman" w:hAnsi="Times New Roman" w:cs="Times New Roman"/>
@@ -1286,18 +1294,7 @@
           <w:sz w:val="28"/>
           <w:szCs w:val="28"/>
         </w:rPr>
-        <w:t>the Analysis</w:t>
-      </w:r>
-      <w:proofErr w:type="gramEnd"/>
-      <w:r>
-        <w:rPr>
-          <w:rFonts w:ascii="Times New Roman" w:hAnsi="Times New Roman" w:cs="Times New Roman"/>
-          <w:b/>
-          <w:bCs/>
-          <w:sz w:val="28"/>
-          <w:szCs w:val="28"/>
-        </w:rPr>
-        <w:t xml:space="preserve"> Shows</w:t>
+        <w:t>the Analysis Shows</w:t>
       </w:r>
     </w:p>
     <w:p>
@@ -1335,15 +1332,7 @@
         <w:pStyle w:val="TEXT"/>
       </w:pPr>
       <w:r>
-        <w:t xml:space="preserve">In 198 out of 200 observed stress hours in Northern Illinois, at least one cross-region destination was operating normally. The two exceptions occurred during </w:t>
-      </w:r>
-      <w:proofErr w:type="gramStart"/>
-      <w:r>
-        <w:t>a the</w:t>
-      </w:r>
-      <w:proofErr w:type="gramEnd"/>
-      <w:r>
-        <w:t xml:space="preserve"> January 2024 Arctic</w:t>
+        <w:t>In 198 out of 200 observed stress hours in Northern Illinois, at least one cross-region destination was operating normally. The two exceptions occurred during a the January 2024 Arctic</w:t>
       </w:r>
       <w:r>
         <w:t xml:space="preserve"> Blast</w:t>
@@ -1470,31 +1459,7 @@
           <w:lang w:eastAsia="zh-TW"/>
           <w14:ligatures w14:val="none"/>
         </w:rPr>
-        <w:t xml:space="preserve">The pattern reflects the physical structure of the North American grid. Three sources of decorrelation are at work. ERCOT is electrically isolated from the Eastern Interconnection, so no synchronous coupling transmits stress. CAISO operates under a different weather regime, so heat domes and cold fronts that stress the Midwest rarely hit the West Coast at the same time. And afternoon peak hours occur at different clock times across time zones, so when Chicago hits emergency pricing on a hot afternoon, Texas and California are often still climbing toward their own peaks. Winter events are the harder case, because continental cold excursions can stress broad geography simultaneously, but even </w:t>
-      </w:r>
-      <w:proofErr w:type="gramStart"/>
-      <w:r>
-        <w:rPr>
-          <w:rFonts w:ascii="Times New Roman" w:eastAsia="Times New Roman" w:hAnsi="Times New Roman" w:cs="Times New Roman"/>
-          <w:color w:val="000000"/>
-          <w:kern w:val="0"/>
-          <w:szCs w:val="20"/>
-          <w:lang w:eastAsia="zh-TW"/>
-          <w14:ligatures w14:val="none"/>
-        </w:rPr>
-        <w:t>then</w:t>
-      </w:r>
-      <w:proofErr w:type="gramEnd"/>
-      <w:r>
-        <w:rPr>
-          <w:rFonts w:ascii="Times New Roman" w:eastAsia="Times New Roman" w:hAnsi="Times New Roman" w:cs="Times New Roman"/>
-          <w:color w:val="000000"/>
-          <w:kern w:val="0"/>
-          <w:szCs w:val="20"/>
-          <w:lang w:eastAsia="zh-TW"/>
-          <w14:ligatures w14:val="none"/>
-        </w:rPr>
-        <w:t xml:space="preserve"> cross-region destinations remained available in 99% of observed ComEd stress hours</w:t>
+        <w:t>The pattern reflects the physical structure of the North American grid. Three sources of decorrelation are at work. ERCOT is electrically isolated from the Eastern Interconnection, so no synchronous coupling transmits stress. CAISO operates under a different weather regime, so heat domes and cold fronts that stress the Midwest rarely hit the West Coast at the same time. And afternoon peak hours occur at different clock times across time zones, so when Chicago hits emergency pricing on a hot afternoon, Texas and California are often still climbing toward their own peaks. Winter events are the harder case, because continental cold excursions can stress broad geography simultaneously, but even then cross-region destinations remained available in 99% of observed ComEd stress hours</w:t>
       </w:r>
       <w:r>
         <w:rPr>
@@ -1539,31 +1504,7 @@
           <w:lang w:eastAsia="zh-TW"/>
           <w14:ligatures w14:val="none"/>
         </w:rPr>
-        <w:t xml:space="preserve">How much load can reliably relocate during a grid emergency depends on </w:t>
-      </w:r>
-      <w:proofErr w:type="gramStart"/>
-      <w:r>
-        <w:rPr>
-          <w:rFonts w:ascii="Times New Roman" w:eastAsia="Times New Roman" w:hAnsi="Times New Roman" w:cs="Times New Roman"/>
-          <w:color w:val="000000"/>
-          <w:kern w:val="0"/>
-          <w:szCs w:val="20"/>
-          <w:lang w:eastAsia="zh-TW"/>
-          <w14:ligatures w14:val="none"/>
-        </w:rPr>
-        <w:t>a chain</w:t>
-      </w:r>
-      <w:proofErr w:type="gramEnd"/>
-      <w:r>
-        <w:rPr>
-          <w:rFonts w:ascii="Times New Roman" w:eastAsia="Times New Roman" w:hAnsi="Times New Roman" w:cs="Times New Roman"/>
-          <w:color w:val="000000"/>
-          <w:kern w:val="0"/>
-          <w:szCs w:val="20"/>
-          <w:lang w:eastAsia="zh-TW"/>
-          <w14:ligatures w14:val="none"/>
-        </w:rPr>
-        <w:t xml:space="preserve"> of real-world source, destination, and execution constraints</w:t>
+        <w:t>How much load can reliably relocate during a grid emergency depends on a chain of real-world source, destination, and execution constraints</w:t>
       </w:r>
       <w:r>
         <w:rPr>
@@ -1704,31 +1645,7 @@
           <w:lang w:eastAsia="zh-TW"/>
           <w14:ligatures w14:val="none"/>
         </w:rPr>
-        <w:t xml:space="preserve">Data centers already manage </w:t>
-      </w:r>
-      <w:proofErr w:type="gramStart"/>
-      <w:r>
-        <w:rPr>
-          <w:rFonts w:ascii="Times New Roman" w:eastAsia="Times New Roman" w:hAnsi="Times New Roman" w:cs="Times New Roman"/>
-          <w:color w:val="000000"/>
-          <w:kern w:val="0"/>
-          <w:szCs w:val="20"/>
-          <w:lang w:eastAsia="zh-TW"/>
-          <w14:ligatures w14:val="none"/>
-        </w:rPr>
-        <w:t>load</w:t>
-      </w:r>
-      <w:proofErr w:type="gramEnd"/>
-      <w:r>
-        <w:rPr>
-          <w:rFonts w:ascii="Times New Roman" w:eastAsia="Times New Roman" w:hAnsi="Times New Roman" w:cs="Times New Roman"/>
-          <w:color w:val="000000"/>
-          <w:kern w:val="0"/>
-          <w:szCs w:val="20"/>
-          <w:lang w:eastAsia="zh-TW"/>
-          <w14:ligatures w14:val="none"/>
-        </w:rPr>
-        <w:t xml:space="preserve"> across regions for commercial purposes. But without a mechanism to make that flexibility visible to the grid and compensate operators for committing it as a binding obligation, the grid plans around them as if they are inflexible. Generation gets built to serve their full nameplate load, and ratepayers pay for it. </w:t>
+        <w:t xml:space="preserve">Data centers already manage load across regions for commercial purposes. But without a mechanism to make that flexibility visible to the grid and compensate operators for committing it as a binding obligation, the grid plans around them as if they are inflexible. Generation gets built to serve their full nameplate load, and ratepayers pay for it. </w:t>
       </w:r>
       <w:r>
         <w:rPr>
@@ -1860,31 +1777,7 @@
           <w:lang w:eastAsia="zh-TW"/>
           <w14:ligatures w14:val="none"/>
         </w:rPr>
-        <w:t xml:space="preserve">Under current practice, a data center may wait years for network upgrade studies and construction to </w:t>
-      </w:r>
-      <w:proofErr w:type="gramStart"/>
-      <w:r>
-        <w:rPr>
-          <w:rFonts w:ascii="Times New Roman" w:eastAsia="Times New Roman" w:hAnsi="Times New Roman" w:cs="Times New Roman"/>
-          <w:color w:val="000000"/>
-          <w:kern w:val="0"/>
-          <w:szCs w:val="20"/>
-          <w:lang w:eastAsia="zh-TW"/>
-          <w14:ligatures w14:val="none"/>
-        </w:rPr>
-        <w:t>complete</w:t>
-      </w:r>
-      <w:proofErr w:type="gramEnd"/>
-      <w:r>
-        <w:rPr>
-          <w:rFonts w:ascii="Times New Roman" w:eastAsia="Times New Roman" w:hAnsi="Times New Roman" w:cs="Times New Roman"/>
-          <w:color w:val="000000"/>
-          <w:kern w:val="0"/>
-          <w:szCs w:val="20"/>
-          <w:lang w:eastAsia="zh-TW"/>
-          <w14:ligatures w14:val="none"/>
-        </w:rPr>
-        <w:t xml:space="preserve"> before it can energize.</w:t>
+        <w:t>Under current practice, a data center may wait years for network upgrade studies and construction to complete before it can energize.</w:t>
       </w:r>
       <w:r>
         <w:rPr>
@@ -2119,53 +2012,84 @@
           <w:lang w:eastAsia="zh-TW"/>
           <w14:ligatures w14:val="none"/>
         </w:rPr>
+        <w:t xml:space="preserve"> years</w:t>
+      </w:r>
+      <w:r>
+        <w:rPr>
+          <w:rFonts w:ascii="Times New Roman" w:eastAsia="Times New Roman" w:hAnsi="Times New Roman" w:cs="Times New Roman"/>
+          <w:color w:val="000000"/>
+          <w:kern w:val="0"/>
+          <w:szCs w:val="20"/>
+          <w:lang w:eastAsia="zh-TW"/>
+          <w14:ligatures w14:val="none"/>
+        </w:rPr>
+        <w:t>-</w:t>
+      </w:r>
+      <w:r>
+        <w:rPr>
+          <w:rFonts w:ascii="Times New Roman" w:eastAsia="Times New Roman" w:hAnsi="Times New Roman" w:cs="Times New Roman"/>
+          <w:color w:val="000000"/>
+          <w:kern w:val="0"/>
+          <w:szCs w:val="20"/>
+          <w:lang w:eastAsia="zh-TW"/>
+          <w14:ligatures w14:val="none"/>
+        </w:rPr>
+        <w:t xml:space="preserve">long </w:t>
+      </w:r>
+      <w:r>
+        <w:rPr>
+          <w:rFonts w:ascii="Times New Roman" w:eastAsia="Times New Roman" w:hAnsi="Times New Roman" w:cs="Times New Roman"/>
+          <w:color w:val="000000"/>
+          <w:kern w:val="0"/>
+          <w:szCs w:val="20"/>
+          <w:lang w:eastAsia="zh-TW"/>
+          <w14:ligatures w14:val="none"/>
+        </w:rPr>
+        <w:t>interconnection delays</w:t>
+      </w:r>
+      <w:r>
+        <w:rPr>
+          <w:rFonts w:ascii="Times New Roman" w:eastAsia="Times New Roman" w:hAnsi="Times New Roman" w:cs="Times New Roman"/>
+          <w:color w:val="000000"/>
+          <w:kern w:val="0"/>
+          <w:szCs w:val="20"/>
+          <w:lang w:eastAsia="zh-TW"/>
+          <w14:ligatures w14:val="none"/>
+        </w:rPr>
         <w:t xml:space="preserve"> </w:t>
       </w:r>
-      <w:proofErr w:type="gramStart"/>
-      <w:r>
-        <w:rPr>
-          <w:rFonts w:ascii="Times New Roman" w:eastAsia="Times New Roman" w:hAnsi="Times New Roman" w:cs="Times New Roman"/>
-          <w:color w:val="000000"/>
-          <w:kern w:val="0"/>
-          <w:szCs w:val="20"/>
-          <w:lang w:eastAsia="zh-TW"/>
-          <w14:ligatures w14:val="none"/>
-        </w:rPr>
-        <w:t>years</w:t>
-      </w:r>
-      <w:proofErr w:type="gramEnd"/>
-      <w:r>
-        <w:rPr>
-          <w:rFonts w:ascii="Times New Roman" w:eastAsia="Times New Roman" w:hAnsi="Times New Roman" w:cs="Times New Roman"/>
-          <w:color w:val="000000"/>
-          <w:kern w:val="0"/>
-          <w:szCs w:val="20"/>
-          <w:lang w:eastAsia="zh-TW"/>
-          <w14:ligatures w14:val="none"/>
-        </w:rPr>
-        <w:t>-</w:t>
-      </w:r>
-      <w:r>
-        <w:rPr>
-          <w:rFonts w:ascii="Times New Roman" w:eastAsia="Times New Roman" w:hAnsi="Times New Roman" w:cs="Times New Roman"/>
-          <w:color w:val="000000"/>
-          <w:kern w:val="0"/>
-          <w:szCs w:val="20"/>
-          <w:lang w:eastAsia="zh-TW"/>
-          <w14:ligatures w14:val="none"/>
-        </w:rPr>
-        <w:t xml:space="preserve">long </w:t>
-      </w:r>
-      <w:r>
-        <w:rPr>
-          <w:rFonts w:ascii="Times New Roman" w:eastAsia="Times New Roman" w:hAnsi="Times New Roman" w:cs="Times New Roman"/>
-          <w:color w:val="000000"/>
-          <w:kern w:val="0"/>
-          <w:szCs w:val="20"/>
-          <w:lang w:eastAsia="zh-TW"/>
-          <w14:ligatures w14:val="none"/>
-        </w:rPr>
-        <w:t>interconnection delays</w:t>
+      <w:r>
+        <w:rPr>
+          <w:rFonts w:ascii="Times New Roman" w:eastAsia="Times New Roman" w:hAnsi="Times New Roman" w:cs="Times New Roman"/>
+          <w:color w:val="000000"/>
+          <w:kern w:val="0"/>
+          <w:szCs w:val="20"/>
+          <w:lang w:eastAsia="zh-TW"/>
+          <w14:ligatures w14:val="none"/>
+        </w:rPr>
+        <w:t xml:space="preserve">and </w:t>
+      </w:r>
+      <w:r>
+        <w:rPr>
+          <w:rFonts w:ascii="Times New Roman" w:eastAsia="Times New Roman" w:hAnsi="Times New Roman" w:cs="Times New Roman"/>
+          <w:color w:val="000000"/>
+          <w:kern w:val="0"/>
+          <w:szCs w:val="20"/>
+          <w:lang w:eastAsia="zh-TW"/>
+          <w14:ligatures w14:val="none"/>
+        </w:rPr>
+        <w:t>captures pot</w:t>
+      </w:r>
+      <w:r>
+        <w:rPr>
+          <w:rFonts w:ascii="Times New Roman" w:eastAsia="Times New Roman" w:hAnsi="Times New Roman" w:cs="Times New Roman"/>
+          <w:color w:val="000000"/>
+          <w:kern w:val="0"/>
+          <w:szCs w:val="20"/>
+          <w:lang w:eastAsia="zh-TW"/>
+          <w14:ligatures w14:val="none"/>
+        </w:rPr>
+        <w:t>entially</w:t>
       </w:r>
       <w:r>
         <w:rPr>
@@ -2187,50 +2111,6 @@
           <w:lang w:eastAsia="zh-TW"/>
           <w14:ligatures w14:val="none"/>
         </w:rPr>
-        <w:t xml:space="preserve">and </w:t>
-      </w:r>
-      <w:r>
-        <w:rPr>
-          <w:rFonts w:ascii="Times New Roman" w:eastAsia="Times New Roman" w:hAnsi="Times New Roman" w:cs="Times New Roman"/>
-          <w:color w:val="000000"/>
-          <w:kern w:val="0"/>
-          <w:szCs w:val="20"/>
-          <w:lang w:eastAsia="zh-TW"/>
-          <w14:ligatures w14:val="none"/>
-        </w:rPr>
-        <w:t>captures pot</w:t>
-      </w:r>
-      <w:r>
-        <w:rPr>
-          <w:rFonts w:ascii="Times New Roman" w:eastAsia="Times New Roman" w:hAnsi="Times New Roman" w:cs="Times New Roman"/>
-          <w:color w:val="000000"/>
-          <w:kern w:val="0"/>
-          <w:szCs w:val="20"/>
-          <w:lang w:eastAsia="zh-TW"/>
-          <w14:ligatures w14:val="none"/>
-        </w:rPr>
-        <w:t>entially</w:t>
-      </w:r>
-      <w:r>
-        <w:rPr>
-          <w:rFonts w:ascii="Times New Roman" w:eastAsia="Times New Roman" w:hAnsi="Times New Roman" w:cs="Times New Roman"/>
-          <w:color w:val="000000"/>
-          <w:kern w:val="0"/>
-          <w:szCs w:val="20"/>
-          <w:lang w:eastAsia="zh-TW"/>
-          <w14:ligatures w14:val="none"/>
-        </w:rPr>
-        <w:t xml:space="preserve"> </w:t>
-      </w:r>
-      <w:r>
-        <w:rPr>
-          <w:rFonts w:ascii="Times New Roman" w:eastAsia="Times New Roman" w:hAnsi="Times New Roman" w:cs="Times New Roman"/>
-          <w:color w:val="000000"/>
-          <w:kern w:val="0"/>
-          <w:szCs w:val="20"/>
-          <w:lang w:eastAsia="zh-TW"/>
-          <w14:ligatures w14:val="none"/>
-        </w:rPr>
         <w:t xml:space="preserve">billions in </w:t>
       </w:r>
       <w:r>
@@ -2253,31 +2133,7 @@
           <w:lang w:eastAsia="zh-TW"/>
           <w14:ligatures w14:val="none"/>
         </w:rPr>
-        <w:t xml:space="preserve">foregone </w:t>
-      </w:r>
-      <w:proofErr w:type="gramStart"/>
-      <w:r>
-        <w:rPr>
-          <w:rFonts w:ascii="Times New Roman" w:eastAsia="Times New Roman" w:hAnsi="Times New Roman" w:cs="Times New Roman"/>
-          <w:color w:val="000000"/>
-          <w:kern w:val="0"/>
-          <w:szCs w:val="20"/>
-          <w:lang w:eastAsia="zh-TW"/>
-          <w14:ligatures w14:val="none"/>
-        </w:rPr>
-        <w:t>compute</w:t>
-      </w:r>
-      <w:proofErr w:type="gramEnd"/>
-      <w:r>
-        <w:rPr>
-          <w:rFonts w:ascii="Times New Roman" w:eastAsia="Times New Roman" w:hAnsi="Times New Roman" w:cs="Times New Roman"/>
-          <w:color w:val="000000"/>
-          <w:kern w:val="0"/>
-          <w:szCs w:val="20"/>
-          <w:lang w:eastAsia="zh-TW"/>
-          <w14:ligatures w14:val="none"/>
-        </w:rPr>
-        <w:t xml:space="preserve"> revenue</w:t>
+        <w:t>foregone compute revenue</w:t>
       </w:r>
       <w:r>
         <w:rPr>
@@ -2424,31 +2280,7 @@
           <w14:ligatures w14:val="none"/>
         </w:rPr>
         <w:lastRenderedPageBreak/>
-        <w:t xml:space="preserve">economic concern is </w:t>
-      </w:r>
-      <w:proofErr w:type="gramStart"/>
-      <w:r>
-        <w:rPr>
-          <w:rFonts w:ascii="Times New Roman" w:eastAsia="Times New Roman" w:hAnsi="Times New Roman" w:cs="Times New Roman"/>
-          <w:color w:val="000000"/>
-          <w:kern w:val="0"/>
-          <w:szCs w:val="20"/>
-          <w:lang w:eastAsia="zh-TW"/>
-          <w14:ligatures w14:val="none"/>
-        </w:rPr>
-        <w:t>compute</w:t>
-      </w:r>
-      <w:proofErr w:type="gramEnd"/>
-      <w:r>
-        <w:rPr>
-          <w:rFonts w:ascii="Times New Roman" w:eastAsia="Times New Roman" w:hAnsi="Times New Roman" w:cs="Times New Roman"/>
-          <w:color w:val="000000"/>
-          <w:kern w:val="0"/>
-          <w:szCs w:val="20"/>
-          <w:lang w:eastAsia="zh-TW"/>
-          <w14:ligatures w14:val="none"/>
-        </w:rPr>
-        <w:t xml:space="preserve"> availability and whose interconnection is already complete, the marginal value of capacity market revenue has not been sufficient to justify the operational burden of binding commitments. As capacity prices rise and flexibility becomes a standard component of data center operations, Phase 2 becomes attractive for this population as well. </w:t>
+        <w:t xml:space="preserve">economic concern is compute availability and whose interconnection is already complete, the marginal value of capacity market revenue has not been sufficient to justify the operational burden of binding commitments. As capacity prices rise and flexibility becomes a standard component of data center operations, Phase 2 becomes attractive for this population as well. </w:t>
       </w:r>
     </w:p>
     <w:p>
@@ -2594,31 +2426,7 @@
           <w:lang w:eastAsia="zh-TW"/>
           <w14:ligatures w14:val="none"/>
         </w:rPr>
-        <w:t xml:space="preserve">he central feature of this framework is </w:t>
-      </w:r>
-      <w:proofErr w:type="gramStart"/>
-      <w:r>
-        <w:rPr>
-          <w:rFonts w:ascii="Times New Roman" w:eastAsia="Times New Roman" w:hAnsi="Times New Roman" w:cs="Times New Roman"/>
-          <w:color w:val="000000"/>
-          <w:kern w:val="0"/>
-          <w:szCs w:val="20"/>
-          <w:lang w:eastAsia="zh-TW"/>
-          <w14:ligatures w14:val="none"/>
-        </w:rPr>
-        <w:t>a transfer</w:t>
-      </w:r>
-      <w:proofErr w:type="gramEnd"/>
-      <w:r>
-        <w:rPr>
-          <w:rFonts w:ascii="Times New Roman" w:eastAsia="Times New Roman" w:hAnsi="Times New Roman" w:cs="Times New Roman"/>
-          <w:color w:val="000000"/>
-          <w:kern w:val="0"/>
-          <w:szCs w:val="20"/>
-          <w:lang w:eastAsia="zh-TW"/>
-          <w14:ligatures w14:val="none"/>
-        </w:rPr>
-        <w:t xml:space="preserve"> of reliability risk. Under the status quo, the grid bears the full obligation to ensure sufficient resources exist to serve data center load, and ratepayers bear the cost when it falls short. Under this framework, the data center takes on responsibility for managing a portion of its own power availability during emergencies. That is a real operational burden. The natural decorrelation of grid stress across interconnection boundaries is a physical property of the North American grid, but exploiting it requires multi-region infrastructure, operational migration capability, and monitoring systems. These operators have already built that infrastructure for commercial reasons.</w:t>
+        <w:t>he central feature of this framework is a transfer of reliability risk. Under the status quo, the grid bears the full obligation to ensure sufficient resources exist to serve data center load, and ratepayers bear the cost when it falls short. Under this framework, the data center takes on responsibility for managing a portion of its own power availability during emergencies. That is a real operational burden. The natural decorrelation of grid stress across interconnection boundaries is a physical property of the North American grid, but exploiting it requires multi-region infrastructure, operational migration capability, and monitoring systems. These operators have already built that infrastructure for commercial reasons.</w:t>
       </w:r>
     </w:p>
     <w:p>
@@ -2789,33 +2597,7 @@
           <w:lang w:eastAsia="zh-TW"/>
           <w14:ligatures w14:val="none"/>
         </w:rPr>
-        <w:t xml:space="preserve">The author thanks Robert Rosner for advisory support and substantive feedback on this work. This research was supported by the Bartlett Fellowship in Energy Policy at the Energy Policy Institute </w:t>
-      </w:r>
-      <w:proofErr w:type="gramStart"/>
-      <w:r>
-        <w:rPr>
-          <w:rFonts w:ascii="Times New Roman" w:eastAsia="Times New Roman" w:hAnsi="Times New Roman" w:cs="Times New Roman"/>
-          <w:bCs/>
-          <w:color w:val="000000"/>
-          <w:kern w:val="0"/>
-          <w:szCs w:val="20"/>
-          <w:lang w:eastAsia="zh-TW"/>
-          <w14:ligatures w14:val="none"/>
-        </w:rPr>
-        <w:t>at</w:t>
-      </w:r>
-      <w:proofErr w:type="gramEnd"/>
-      <w:r>
-        <w:rPr>
-          <w:rFonts w:ascii="Times New Roman" w:eastAsia="Times New Roman" w:hAnsi="Times New Roman" w:cs="Times New Roman"/>
-          <w:bCs/>
-          <w:color w:val="000000"/>
-          <w:kern w:val="0"/>
-          <w:szCs w:val="20"/>
-          <w:lang w:eastAsia="zh-TW"/>
-          <w14:ligatures w14:val="none"/>
-        </w:rPr>
-        <w:t xml:space="preserve"> Chicago.</w:t>
+        <w:t>The author thanks Robert Rosner for advisory support and substantive feedback on this work. This research was supported by the Bartlett Fellowship in Energy Policy at the Energy Policy Institute at Chicago.</w:t>
       </w:r>
     </w:p>
     <w:p>
@@ -3097,21 +2879,7 @@
         <w:rPr>
           <w:rFonts w:eastAsia="Georgia"/>
         </w:rPr>
-        <w:t xml:space="preserve">Colangelo, P., et al., "AI Data </w:t>
-      </w:r>
-      <w:proofErr w:type="spellStart"/>
-      <w:r>
-        <w:rPr>
-          <w:rFonts w:eastAsia="Georgia"/>
-        </w:rPr>
-        <w:t>Centres</w:t>
-      </w:r>
-      <w:proofErr w:type="spellEnd"/>
-      <w:r>
-        <w:rPr>
-          <w:rFonts w:eastAsia="Georgia"/>
-        </w:rPr>
-        <w:t xml:space="preserve"> as Grid-Interactive Assets," Nature Energy (2025), </w:t>
+        <w:t xml:space="preserve">Colangelo, P., et al., "AI Data Centres as Grid-Interactive Assets," Nature Energy (2025), </w:t>
       </w:r>
       <w:hyperlink r:id="rId1" w:history="1">
         <w:r>
@@ -3126,21 +2894,7 @@
         <w:rPr>
           <w:rFonts w:eastAsia="Georgia"/>
         </w:rPr>
-        <w:t xml:space="preserve">. Earlier work established that data center workloads can be shifted geographically for renewable energy absorption: </w:t>
-      </w:r>
-      <w:proofErr w:type="spellStart"/>
-      <w:r>
-        <w:rPr>
-          <w:rFonts w:eastAsia="Georgia"/>
-        </w:rPr>
-        <w:t>Jiajia</w:t>
-      </w:r>
-      <w:proofErr w:type="spellEnd"/>
-      <w:r>
-        <w:rPr>
-          <w:rFonts w:eastAsia="Georgia"/>
-        </w:rPr>
-        <w:t xml:space="preserve"> Zheng, Andrew A. Chien, and Sangwon Suh, "Mitigating Curtailment and Carbon Emissions through Load Migration between Data Centers," </w:t>
+        <w:t xml:space="preserve">. Earlier work established that data center workloads can be shifted geographically for renewable energy absorption: Jiajia Zheng, Andrew A. Chien, and Sangwon Suh, "Mitigating Curtailment and Carbon Emissions through Load Migration between Data Centers," </w:t>
       </w:r>
       <w:r>
         <w:rPr>
@@ -3198,21 +2952,7 @@
         <w:rPr>
           <w:rFonts w:eastAsia="Georgia"/>
         </w:rPr>
-        <w:t xml:space="preserve">Analysis uses 35,060 hours of day-ahead locational marginal pricing data (January 2022–December 2025) from PJM, ERCOT, CAISO, MISO, and NYISO, covering 19 destination pricing zones mapped to data center locations using the </w:t>
-      </w:r>
-      <w:proofErr w:type="spellStart"/>
-      <w:r>
-        <w:rPr>
-          <w:rFonts w:eastAsia="Georgia"/>
-        </w:rPr>
-        <w:t>Baxtel</w:t>
-      </w:r>
-      <w:proofErr w:type="spellEnd"/>
-      <w:r>
-        <w:rPr>
-          <w:rFonts w:eastAsia="Georgia"/>
-        </w:rPr>
-        <w:t>/DOE county-level inventory. Day-ahead LMP price spikes are used as a proxy for grid stress.</w:t>
+        <w:t>Analysis uses 35,060 hours of day-ahead locational marginal pricing data (January 2022–December 2025) from PJM, ERCOT, CAISO, MISO, and NYISO, covering 19 destination pricing zones mapped to data center locations using the Baxtel/DOE county-level inventory. Day-ahead LMP price spikes are used as a proxy for grid stress.</w:t>
       </w:r>
     </w:p>
   </w:footnote>
@@ -3272,21 +3012,7 @@
         <w:rPr>
           <w:rFonts w:eastAsia="Georgia"/>
         </w:rPr>
-        <w:t xml:space="preserve">ERCOT operates under a connect-and-manage framework for generators, allowing new resources to interconnect before all network upgrades are complete, with redispatch and curtailment managing congestion in the interim. ERCOT interconnected 14.2 GW in 2021–2022, compared to 5.6 GW for PJM over the same period. See Ethan Howland, "Can ERCOT Show the Way to Faster and Cheaper Grid </w:t>
-      </w:r>
-      <w:proofErr w:type="gramStart"/>
-      <w:r>
-        <w:rPr>
-          <w:rFonts w:eastAsia="Georgia"/>
-        </w:rPr>
-        <w:t>Interconnection?,</w:t>
-      </w:r>
-      <w:proofErr w:type="gramEnd"/>
-      <w:r>
-        <w:rPr>
-          <w:rFonts w:eastAsia="Georgia"/>
-        </w:rPr>
-        <w:t>" Utility Dive, November 27, 2023.</w:t>
+        <w:t>ERCOT operates under a connect-and-manage framework for generators, allowing new resources to interconnect before all network upgrades are complete, with redispatch and curtailment managing congestion in the interim. ERCOT interconnected 14.2 GW in 2021–2022, compared to 5.6 GW for PJM over the same period. See Ethan Howland, "Can ERCOT Show the Way to Faster and Cheaper Grid Interconnection?," Utility Dive, November 27, 2023.</w:t>
       </w:r>
     </w:p>
   </w:footnote>
@@ -3324,15 +3050,7 @@
         <w:t xml:space="preserve"> </w:t>
       </w:r>
       <w:r>
-        <w:t xml:space="preserve">For a 1 GW facility, the present value of accelerated interconnection is on the order of billions of dollars over a three-year acceleration window, computed from foregone compute revenue at prevailing </w:t>
-      </w:r>
-      <w:proofErr w:type="spellStart"/>
-      <w:r>
-        <w:t>hyperscaler</w:t>
-      </w:r>
-      <w:proofErr w:type="spellEnd"/>
-      <w:r>
-        <w:t xml:space="preserve"> capital expenditure rates. The estimate is highly sensitive to assumptions about revenue per MW and acceleration duration, but even under conservative assumptions substantially exceeds plausible capacity market revenue.</w:t>
+        <w:t>For a 1 GW facility, the present value of accelerated interconnection is on the order of billions of dollars over a three-year acceleration window, computed from foregone compute revenue at prevailing hyperscaler capital expenditure rates. The estimate is highly sensitive to assumptions about revenue per MW and acceleration duration, but even under conservative assumptions substantially exceeds plausible capacity market revenue.</w:t>
       </w:r>
     </w:p>
   </w:footnote>

</xml_diff>

<commit_message>
Add Extended Data exports (Fig 1, Tables 1-2); new NB01 cells 3-8/3-9; new NB03 cell 3-2; v20 and EPIC article updates; ignore Word temp files
</commit_message>
<xml_diff>
--- a/paper/Dunlap_EPIC_Article_Submission.docx
+++ b/paper/Dunlap_EPIC_Article_Submission.docx
@@ -1286,6 +1286,7 @@
         </w:rPr>
         <w:t xml:space="preserve">What </w:t>
       </w:r>
+      <w:proofErr w:type="gramStart"/>
       <w:r>
         <w:rPr>
           <w:rFonts w:ascii="Times New Roman" w:hAnsi="Times New Roman" w:cs="Times New Roman"/>
@@ -1294,7 +1295,18 @@
           <w:sz w:val="28"/>
           <w:szCs w:val="28"/>
         </w:rPr>
-        <w:t>the Analysis Shows</w:t>
+        <w:t>the Analysis</w:t>
+      </w:r>
+      <w:proofErr w:type="gramEnd"/>
+      <w:r>
+        <w:rPr>
+          <w:rFonts w:ascii="Times New Roman" w:hAnsi="Times New Roman" w:cs="Times New Roman"/>
+          <w:b/>
+          <w:bCs/>
+          <w:sz w:val="28"/>
+          <w:szCs w:val="28"/>
+        </w:rPr>
+        <w:t xml:space="preserve"> Shows</w:t>
       </w:r>
     </w:p>
     <w:p>
@@ -1332,7 +1344,15 @@
         <w:pStyle w:val="TEXT"/>
       </w:pPr>
       <w:r>
-        <w:t>In 198 out of 200 observed stress hours in Northern Illinois, at least one cross-region destination was operating normally. The two exceptions occurred during a the January 2024 Arctic</w:t>
+        <w:t xml:space="preserve">In 198 out of 200 observed stress hours in Northern Illinois, at least one cross-region destination was operating normally. The two exceptions occurred during </w:t>
+      </w:r>
+      <w:proofErr w:type="gramStart"/>
+      <w:r>
+        <w:t>a the</w:t>
+      </w:r>
+      <w:proofErr w:type="gramEnd"/>
+      <w:r>
+        <w:t xml:space="preserve"> January 2024 Arctic</w:t>
       </w:r>
       <w:r>
         <w:t xml:space="preserve"> Blast</w:t>
@@ -1459,7 +1479,31 @@
           <w:lang w:eastAsia="zh-TW"/>
           <w14:ligatures w14:val="none"/>
         </w:rPr>
-        <w:t>The pattern reflects the physical structure of the North American grid. Three sources of decorrelation are at work. ERCOT is electrically isolated from the Eastern Interconnection, so no synchronous coupling transmits stress. CAISO operates under a different weather regime, so heat domes and cold fronts that stress the Midwest rarely hit the West Coast at the same time. And afternoon peak hours occur at different clock times across time zones, so when Chicago hits emergency pricing on a hot afternoon, Texas and California are often still climbing toward their own peaks. Winter events are the harder case, because continental cold excursions can stress broad geography simultaneously, but even then cross-region destinations remained available in 99% of observed ComEd stress hours</w:t>
+        <w:t xml:space="preserve">The pattern reflects the physical structure of the North American grid. Three sources of decorrelation are at work. ERCOT is electrically isolated from the Eastern Interconnection, so no synchronous coupling transmits stress. CAISO operates under a different weather regime, so heat domes and cold fronts that stress the Midwest rarely hit the West Coast at the same time. And afternoon peak hours occur at different clock times across time zones, so when Chicago hits emergency pricing on a hot afternoon, Texas and California are often still climbing toward their own peaks. Winter events are the harder case, because continental cold excursions can stress broad geography simultaneously, but even </w:t>
+      </w:r>
+      <w:proofErr w:type="gramStart"/>
+      <w:r>
+        <w:rPr>
+          <w:rFonts w:ascii="Times New Roman" w:eastAsia="Times New Roman" w:hAnsi="Times New Roman" w:cs="Times New Roman"/>
+          <w:color w:val="000000"/>
+          <w:kern w:val="0"/>
+          <w:szCs w:val="20"/>
+          <w:lang w:eastAsia="zh-TW"/>
+          <w14:ligatures w14:val="none"/>
+        </w:rPr>
+        <w:t>then</w:t>
+      </w:r>
+      <w:proofErr w:type="gramEnd"/>
+      <w:r>
+        <w:rPr>
+          <w:rFonts w:ascii="Times New Roman" w:eastAsia="Times New Roman" w:hAnsi="Times New Roman" w:cs="Times New Roman"/>
+          <w:color w:val="000000"/>
+          <w:kern w:val="0"/>
+          <w:szCs w:val="20"/>
+          <w:lang w:eastAsia="zh-TW"/>
+          <w14:ligatures w14:val="none"/>
+        </w:rPr>
+        <w:t xml:space="preserve"> cross-region destinations remained available in 99% of observed ComEd stress hours</w:t>
       </w:r>
       <w:r>
         <w:rPr>
@@ -1504,7 +1548,31 @@
           <w:lang w:eastAsia="zh-TW"/>
           <w14:ligatures w14:val="none"/>
         </w:rPr>
-        <w:t>How much load can reliably relocate during a grid emergency depends on a chain of real-world source, destination, and execution constraints</w:t>
+        <w:t xml:space="preserve">How much load can reliably relocate during a grid emergency depends on </w:t>
+      </w:r>
+      <w:proofErr w:type="gramStart"/>
+      <w:r>
+        <w:rPr>
+          <w:rFonts w:ascii="Times New Roman" w:eastAsia="Times New Roman" w:hAnsi="Times New Roman" w:cs="Times New Roman"/>
+          <w:color w:val="000000"/>
+          <w:kern w:val="0"/>
+          <w:szCs w:val="20"/>
+          <w:lang w:eastAsia="zh-TW"/>
+          <w14:ligatures w14:val="none"/>
+        </w:rPr>
+        <w:t>a chain</w:t>
+      </w:r>
+      <w:proofErr w:type="gramEnd"/>
+      <w:r>
+        <w:rPr>
+          <w:rFonts w:ascii="Times New Roman" w:eastAsia="Times New Roman" w:hAnsi="Times New Roman" w:cs="Times New Roman"/>
+          <w:color w:val="000000"/>
+          <w:kern w:val="0"/>
+          <w:szCs w:val="20"/>
+          <w:lang w:eastAsia="zh-TW"/>
+          <w14:ligatures w14:val="none"/>
+        </w:rPr>
+        <w:t xml:space="preserve"> of real-world source, destination, and execution constraints</w:t>
       </w:r>
       <w:r>
         <w:rPr>
@@ -1645,7 +1713,31 @@
           <w:lang w:eastAsia="zh-TW"/>
           <w14:ligatures w14:val="none"/>
         </w:rPr>
-        <w:t xml:space="preserve">Data centers already manage load across regions for commercial purposes. But without a mechanism to make that flexibility visible to the grid and compensate operators for committing it as a binding obligation, the grid plans around them as if they are inflexible. Generation gets built to serve their full nameplate load, and ratepayers pay for it. </w:t>
+        <w:t xml:space="preserve">Data centers already manage </w:t>
+      </w:r>
+      <w:proofErr w:type="gramStart"/>
+      <w:r>
+        <w:rPr>
+          <w:rFonts w:ascii="Times New Roman" w:eastAsia="Times New Roman" w:hAnsi="Times New Roman" w:cs="Times New Roman"/>
+          <w:color w:val="000000"/>
+          <w:kern w:val="0"/>
+          <w:szCs w:val="20"/>
+          <w:lang w:eastAsia="zh-TW"/>
+          <w14:ligatures w14:val="none"/>
+        </w:rPr>
+        <w:t>load</w:t>
+      </w:r>
+      <w:proofErr w:type="gramEnd"/>
+      <w:r>
+        <w:rPr>
+          <w:rFonts w:ascii="Times New Roman" w:eastAsia="Times New Roman" w:hAnsi="Times New Roman" w:cs="Times New Roman"/>
+          <w:color w:val="000000"/>
+          <w:kern w:val="0"/>
+          <w:szCs w:val="20"/>
+          <w:lang w:eastAsia="zh-TW"/>
+          <w14:ligatures w14:val="none"/>
+        </w:rPr>
+        <w:t xml:space="preserve"> across regions for commercial purposes. But without a mechanism to make that flexibility visible to the grid and compensate operators for committing it as a binding obligation, the grid plans around them as if they are inflexible. Generation gets built to serve their full nameplate load, and ratepayers pay for it. </w:t>
       </w:r>
       <w:r>
         <w:rPr>
@@ -2012,8 +2104,21 @@
           <w:lang w:eastAsia="zh-TW"/>
           <w14:ligatures w14:val="none"/>
         </w:rPr>
-        <w:t xml:space="preserve"> years</w:t>
-      </w:r>
+        <w:t xml:space="preserve"> </w:t>
+      </w:r>
+      <w:proofErr w:type="gramStart"/>
+      <w:r>
+        <w:rPr>
+          <w:rFonts w:ascii="Times New Roman" w:eastAsia="Times New Roman" w:hAnsi="Times New Roman" w:cs="Times New Roman"/>
+          <w:color w:val="000000"/>
+          <w:kern w:val="0"/>
+          <w:szCs w:val="20"/>
+          <w:lang w:eastAsia="zh-TW"/>
+          <w14:ligatures w14:val="none"/>
+        </w:rPr>
+        <w:t>years</w:t>
+      </w:r>
+      <w:proofErr w:type="gramEnd"/>
       <w:r>
         <w:rPr>
           <w:rFonts w:ascii="Times New Roman" w:eastAsia="Times New Roman" w:hAnsi="Times New Roman" w:cs="Times New Roman"/>
@@ -2133,7 +2238,31 @@
           <w:lang w:eastAsia="zh-TW"/>
           <w14:ligatures w14:val="none"/>
         </w:rPr>
-        <w:t>foregone compute revenue</w:t>
+        <w:t xml:space="preserve">foregone </w:t>
+      </w:r>
+      <w:proofErr w:type="gramStart"/>
+      <w:r>
+        <w:rPr>
+          <w:rFonts w:ascii="Times New Roman" w:eastAsia="Times New Roman" w:hAnsi="Times New Roman" w:cs="Times New Roman"/>
+          <w:color w:val="000000"/>
+          <w:kern w:val="0"/>
+          <w:szCs w:val="20"/>
+          <w:lang w:eastAsia="zh-TW"/>
+          <w14:ligatures w14:val="none"/>
+        </w:rPr>
+        <w:t>compute</w:t>
+      </w:r>
+      <w:proofErr w:type="gramEnd"/>
+      <w:r>
+        <w:rPr>
+          <w:rFonts w:ascii="Times New Roman" w:eastAsia="Times New Roman" w:hAnsi="Times New Roman" w:cs="Times New Roman"/>
+          <w:color w:val="000000"/>
+          <w:kern w:val="0"/>
+          <w:szCs w:val="20"/>
+          <w:lang w:eastAsia="zh-TW"/>
+          <w14:ligatures w14:val="none"/>
+        </w:rPr>
+        <w:t xml:space="preserve"> revenue</w:t>
       </w:r>
       <w:r>
         <w:rPr>
@@ -2280,7 +2409,31 @@
           <w14:ligatures w14:val="none"/>
         </w:rPr>
         <w:lastRenderedPageBreak/>
-        <w:t xml:space="preserve">economic concern is compute availability and whose interconnection is already complete, the marginal value of capacity market revenue has not been sufficient to justify the operational burden of binding commitments. As capacity prices rise and flexibility becomes a standard component of data center operations, Phase 2 becomes attractive for this population as well. </w:t>
+        <w:t xml:space="preserve">economic concern is </w:t>
+      </w:r>
+      <w:proofErr w:type="gramStart"/>
+      <w:r>
+        <w:rPr>
+          <w:rFonts w:ascii="Times New Roman" w:eastAsia="Times New Roman" w:hAnsi="Times New Roman" w:cs="Times New Roman"/>
+          <w:color w:val="000000"/>
+          <w:kern w:val="0"/>
+          <w:szCs w:val="20"/>
+          <w:lang w:eastAsia="zh-TW"/>
+          <w14:ligatures w14:val="none"/>
+        </w:rPr>
+        <w:t>compute</w:t>
+      </w:r>
+      <w:proofErr w:type="gramEnd"/>
+      <w:r>
+        <w:rPr>
+          <w:rFonts w:ascii="Times New Roman" w:eastAsia="Times New Roman" w:hAnsi="Times New Roman" w:cs="Times New Roman"/>
+          <w:color w:val="000000"/>
+          <w:kern w:val="0"/>
+          <w:szCs w:val="20"/>
+          <w:lang w:eastAsia="zh-TW"/>
+          <w14:ligatures w14:val="none"/>
+        </w:rPr>
+        <w:t xml:space="preserve"> availability and whose interconnection is already complete, the marginal value of capacity market revenue has not been sufficient to justify the operational burden of binding commitments. As capacity prices rise and flexibility becomes a standard component of data center operations, Phase 2 becomes attractive for this population as well. </w:t>
       </w:r>
     </w:p>
     <w:p>
@@ -2426,7 +2579,31 @@
           <w:lang w:eastAsia="zh-TW"/>
           <w14:ligatures w14:val="none"/>
         </w:rPr>
-        <w:t>he central feature of this framework is a transfer of reliability risk. Under the status quo, the grid bears the full obligation to ensure sufficient resources exist to serve data center load, and ratepayers bear the cost when it falls short. Under this framework, the data center takes on responsibility for managing a portion of its own power availability during emergencies. That is a real operational burden. The natural decorrelation of grid stress across interconnection boundaries is a physical property of the North American grid, but exploiting it requires multi-region infrastructure, operational migration capability, and monitoring systems. These operators have already built that infrastructure for commercial reasons.</w:t>
+        <w:t xml:space="preserve">he central feature of this framework is </w:t>
+      </w:r>
+      <w:proofErr w:type="gramStart"/>
+      <w:r>
+        <w:rPr>
+          <w:rFonts w:ascii="Times New Roman" w:eastAsia="Times New Roman" w:hAnsi="Times New Roman" w:cs="Times New Roman"/>
+          <w:color w:val="000000"/>
+          <w:kern w:val="0"/>
+          <w:szCs w:val="20"/>
+          <w:lang w:eastAsia="zh-TW"/>
+          <w14:ligatures w14:val="none"/>
+        </w:rPr>
+        <w:t>a transfer</w:t>
+      </w:r>
+      <w:proofErr w:type="gramEnd"/>
+      <w:r>
+        <w:rPr>
+          <w:rFonts w:ascii="Times New Roman" w:eastAsia="Times New Roman" w:hAnsi="Times New Roman" w:cs="Times New Roman"/>
+          <w:color w:val="000000"/>
+          <w:kern w:val="0"/>
+          <w:szCs w:val="20"/>
+          <w:lang w:eastAsia="zh-TW"/>
+          <w14:ligatures w14:val="none"/>
+        </w:rPr>
+        <w:t xml:space="preserve"> of reliability risk. Under the status quo, the grid bears the full obligation to ensure sufficient resources exist to serve data center load, and ratepayers bear the cost when it falls short. Under this framework, the data center takes on responsibility for managing a portion of its own power availability during emergencies. That is a real operational burden. The natural decorrelation of grid stress across interconnection boundaries is a physical property of the North American grid, but exploiting it requires multi-region infrastructure, operational migration capability, and monitoring systems. These operators have already built that infrastructure for commercial reasons.</w:t>
       </w:r>
     </w:p>
     <w:p>
@@ -2597,7 +2774,33 @@
           <w:lang w:eastAsia="zh-TW"/>
           <w14:ligatures w14:val="none"/>
         </w:rPr>
-        <w:t>The author thanks Robert Rosner for advisory support and substantive feedback on this work. This research was supported by the Bartlett Fellowship in Energy Policy at the Energy Policy Institute at Chicago.</w:t>
+        <w:t xml:space="preserve">The author thanks Robert Rosner for advisory support and substantive feedback on this work. This research was supported by the Bartlett Fellowship in Energy Policy at the Energy Policy Institute </w:t>
+      </w:r>
+      <w:proofErr w:type="gramStart"/>
+      <w:r>
+        <w:rPr>
+          <w:rFonts w:ascii="Times New Roman" w:eastAsia="Times New Roman" w:hAnsi="Times New Roman" w:cs="Times New Roman"/>
+          <w:bCs/>
+          <w:color w:val="000000"/>
+          <w:kern w:val="0"/>
+          <w:szCs w:val="20"/>
+          <w:lang w:eastAsia="zh-TW"/>
+          <w14:ligatures w14:val="none"/>
+        </w:rPr>
+        <w:t>at</w:t>
+      </w:r>
+      <w:proofErr w:type="gramEnd"/>
+      <w:r>
+        <w:rPr>
+          <w:rFonts w:ascii="Times New Roman" w:eastAsia="Times New Roman" w:hAnsi="Times New Roman" w:cs="Times New Roman"/>
+          <w:bCs/>
+          <w:color w:val="000000"/>
+          <w:kern w:val="0"/>
+          <w:szCs w:val="20"/>
+          <w:lang w:eastAsia="zh-TW"/>
+          <w14:ligatures w14:val="none"/>
+        </w:rPr>
+        <w:t xml:space="preserve"> Chicago.</w:t>
       </w:r>
     </w:p>
     <w:p>
@@ -2971,7 +3174,19 @@
         <w:t xml:space="preserve"> </w:t>
       </w:r>
       <w:r>
-        <w:t>Estimates derive from a ten-parameter multiplicative cascade modeling source-side, destination-side, and execution constraints on spatial migration, validated against observed grid stress events using a conditional Monte Carlo simulation. For an individual inference-dominant facility, mean commitment depth is approximately 52% when spatial migration is combined with local power scaling. The result is scale-dependent: as multiple co-stressed facilities migrate simultaneously and compete for finite destination capacity, fleet-level commitment depth declines to approximately 25% at 10 GW of aggregate inference-dominant capacity. Three destination-side parameters dominate model uncertainty: utilization headroom at receiving facilities, the share of destination workloads running compatible inference, and operational readiness of model weight pre-staging across geographically diverse facilities.</w:t>
+        <w:t xml:space="preserve">Estimates derive from a ten-parameter multiplicative cascade modeling source-side, destination-side, and execution constraints on spatial migration, validated against observed grid stress events using a conditional Monte Carlo simulation. For an individual inference-dominant facility, mean commitment depth is approximately </w:t>
+      </w:r>
+      <w:r>
+        <w:t>46.9</w:t>
+      </w:r>
+      <w:r>
+        <w:t>% when spatial migration is combined with local power scaling. The result is scale-dependent: as multiple co-stressed facilities migrate simultaneously and compete for finite destination capacity, fleet-level commitment depth declines to approximately 2</w:t>
+      </w:r>
+      <w:r>
+        <w:t>6.9</w:t>
+      </w:r>
+      <w:r>
+        <w:t>% at 10 GW of aggregate inference-dominant capacity. Three destination-side parameters dominate model uncertainty: utilization headroom at receiving facilities, the share of destination workloads running compatible inference, and operational readiness of model weight pre-staging across geographically diverse facilities.</w:t>
       </w:r>
     </w:p>
   </w:footnote>
@@ -3012,7 +3227,21 @@
         <w:rPr>
           <w:rFonts w:eastAsia="Georgia"/>
         </w:rPr>
-        <w:t>ERCOT operates under a connect-and-manage framework for generators, allowing new resources to interconnect before all network upgrades are complete, with redispatch and curtailment managing congestion in the interim. ERCOT interconnected 14.2 GW in 2021–2022, compared to 5.6 GW for PJM over the same period. See Ethan Howland, "Can ERCOT Show the Way to Faster and Cheaper Grid Interconnection?," Utility Dive, November 27, 2023.</w:t>
+        <w:t xml:space="preserve">ERCOT operates under a connect-and-manage framework for generators, allowing new resources to interconnect before all network upgrades are complete, with redispatch and curtailment managing congestion in the interim. ERCOT interconnected 14.2 GW in 2021–2022, compared to 5.6 GW for PJM over the same period. See Ethan Howland, "Can ERCOT Show the Way to Faster and Cheaper Grid </w:t>
+      </w:r>
+      <w:proofErr w:type="gramStart"/>
+      <w:r>
+        <w:rPr>
+          <w:rFonts w:eastAsia="Georgia"/>
+        </w:rPr>
+        <w:t>Interconnection?,</w:t>
+      </w:r>
+      <w:proofErr w:type="gramEnd"/>
+      <w:r>
+        <w:rPr>
+          <w:rFonts w:eastAsia="Georgia"/>
+        </w:rPr>
+        <w:t>" Utility Dive, November 27, 2023.</w:t>
       </w:r>
     </w:p>
   </w:footnote>
@@ -3784,6 +4013,7 @@
   <w:style w:type="character" w:default="1" w:styleId="DefaultParagraphFont">
     <w:name w:val="Default Paragraph Font"/>
     <w:uiPriority w:val="1"/>
+    <w:semiHidden/>
     <w:unhideWhenUsed/>
   </w:style>
   <w:style w:type="table" w:default="1" w:styleId="TableNormal">

</xml_diff>

<commit_message>
Ignore Rosner draft; update README title; correct EPIC footnote values to reflect final pipeline (46.9% / 26.9%)
</commit_message>
<xml_diff>
--- a/paper/Dunlap_EPIC_Article_Submission.docx
+++ b/paper/Dunlap_EPIC_Article_Submission.docx
@@ -337,7 +337,19 @@
           <w:lang w:eastAsia="zh-TW"/>
           <w14:ligatures w14:val="none"/>
         </w:rPr>
-        <w:t xml:space="preserve"> hyper</w:t>
+        <w:t xml:space="preserve"> </w:t>
+      </w:r>
+      <w:proofErr w:type="spellStart"/>
+      <w:r>
+        <w:rPr>
+          <w:rFonts w:ascii="Times New Roman" w:eastAsia="Times New Roman" w:hAnsi="Times New Roman" w:cs="Times New Roman"/>
+          <w:color w:val="000000"/>
+          <w:kern w:val="0"/>
+          <w:szCs w:val="20"/>
+          <w:lang w:eastAsia="zh-TW"/>
+          <w14:ligatures w14:val="none"/>
+        </w:rPr>
+        <w:t>hyper</w:t>
       </w:r>
       <w:r>
         <w:rPr>
@@ -361,6 +373,7 @@
         </w:rPr>
         <w:t>calers</w:t>
       </w:r>
+      <w:proofErr w:type="spellEnd"/>
       <w:r>
         <w:rPr>
           <w:rFonts w:ascii="Times New Roman" w:eastAsia="Times New Roman" w:hAnsi="Times New Roman" w:cs="Times New Roman"/>
@@ -3082,7 +3095,21 @@
         <w:rPr>
           <w:rFonts w:eastAsia="Georgia"/>
         </w:rPr>
-        <w:t xml:space="preserve">Colangelo, P., et al., "AI Data Centres as Grid-Interactive Assets," Nature Energy (2025), </w:t>
+        <w:t xml:space="preserve">Colangelo, P., et al., "AI Data </w:t>
+      </w:r>
+      <w:proofErr w:type="spellStart"/>
+      <w:r>
+        <w:rPr>
+          <w:rFonts w:eastAsia="Georgia"/>
+        </w:rPr>
+        <w:t>Centres</w:t>
+      </w:r>
+      <w:proofErr w:type="spellEnd"/>
+      <w:r>
+        <w:rPr>
+          <w:rFonts w:eastAsia="Georgia"/>
+        </w:rPr>
+        <w:t xml:space="preserve"> as Grid-Interactive Assets," Nature Energy (2025), </w:t>
       </w:r>
       <w:hyperlink r:id="rId1" w:history="1">
         <w:r>
@@ -3097,7 +3124,21 @@
         <w:rPr>
           <w:rFonts w:eastAsia="Georgia"/>
         </w:rPr>
-        <w:t xml:space="preserve">. Earlier work established that data center workloads can be shifted geographically for renewable energy absorption: Jiajia Zheng, Andrew A. Chien, and Sangwon Suh, "Mitigating Curtailment and Carbon Emissions through Load Migration between Data Centers," </w:t>
+        <w:t xml:space="preserve">. Earlier work established that data center workloads can be shifted geographically for renewable energy absorption: </w:t>
+      </w:r>
+      <w:proofErr w:type="spellStart"/>
+      <w:r>
+        <w:rPr>
+          <w:rFonts w:eastAsia="Georgia"/>
+        </w:rPr>
+        <w:t>Jiajia</w:t>
+      </w:r>
+      <w:proofErr w:type="spellEnd"/>
+      <w:r>
+        <w:rPr>
+          <w:rFonts w:eastAsia="Georgia"/>
+        </w:rPr>
+        <w:t xml:space="preserve"> Zheng, Andrew A. Chien, and Sangwon Suh, "Mitigating Curtailment and Carbon Emissions through Load Migration between Data Centers," </w:t>
       </w:r>
       <w:r>
         <w:rPr>
@@ -3155,7 +3196,21 @@
         <w:rPr>
           <w:rFonts w:eastAsia="Georgia"/>
         </w:rPr>
-        <w:t>Analysis uses 35,060 hours of day-ahead locational marginal pricing data (January 2022–December 2025) from PJM, ERCOT, CAISO, MISO, and NYISO, covering 19 destination pricing zones mapped to data center locations using the Baxtel/DOE county-level inventory. Day-ahead LMP price spikes are used as a proxy for grid stress.</w:t>
+        <w:t xml:space="preserve">Analysis uses 35,060 hours of day-ahead locational marginal pricing data (January 2022–December 2025) from PJM, ERCOT, CAISO, MISO, and NYISO, covering 19 destination pricing zones mapped to data center locations using the </w:t>
+      </w:r>
+      <w:proofErr w:type="spellStart"/>
+      <w:r>
+        <w:rPr>
+          <w:rFonts w:eastAsia="Georgia"/>
+        </w:rPr>
+        <w:t>Baxtel</w:t>
+      </w:r>
+      <w:proofErr w:type="spellEnd"/>
+      <w:r>
+        <w:rPr>
+          <w:rFonts w:eastAsia="Georgia"/>
+        </w:rPr>
+        <w:t>/DOE county-level inventory. Day-ahead LMP price spikes are used as a proxy for grid stress.</w:t>
       </w:r>
     </w:p>
   </w:footnote>
@@ -3279,7 +3334,15 @@
         <w:t xml:space="preserve"> </w:t>
       </w:r>
       <w:r>
-        <w:t>For a 1 GW facility, the present value of accelerated interconnection is on the order of billions of dollars over a three-year acceleration window, computed from foregone compute revenue at prevailing hyperscaler capital expenditure rates. The estimate is highly sensitive to assumptions about revenue per MW and acceleration duration, but even under conservative assumptions substantially exceeds plausible capacity market revenue.</w:t>
+        <w:t xml:space="preserve">For a 1 GW facility, the present value of accelerated interconnection is on the order of billions of dollars over a three-year acceleration window, computed from foregone compute revenue at prevailing </w:t>
+      </w:r>
+      <w:proofErr w:type="spellStart"/>
+      <w:r>
+        <w:t>hyperscaler</w:t>
+      </w:r>
+      <w:proofErr w:type="spellEnd"/>
+      <w:r>
+        <w:t xml:space="preserve"> capital expenditure rates. The estimate is highly sensitive to assumptions about revenue per MW and acceleration duration, but even under conservative assumptions substantially exceeds plausible capacity market revenue.</w:t>
       </w:r>
     </w:p>
   </w:footnote>

</xml_diff>